<commit_message>
Add TEST_MODE: no-login committee console for functional testing (demo + Supabase), test_mode_on/off SQL, guide fast path
</commit_message>
<xml_diff>
--- a/docs/Troop420_Supabase_Setup_Guide.docx
+++ b/docs/Troop420_Supabase_Setup_Guide.docx
@@ -1829,6 +1829,514 @@
       </w:r>
       <w:r>
         <w:t xml:space="preserve"> is a security definer view, that is intentional. The view exists to show approved rows to the public while the entries table itself stays private.</w:t>
+      </w:r>
+    </w:p>
+    <w:p>
+      <w:r>
+        <w:br w:type="page"/>
+      </w:r>
+    </w:p>
+    <w:p>
+      <w:pPr>
+        <w:pStyle w:val="Heading1"/>
+      </w:pPr>
+      <w:r>
+        <w:rPr>
+          <w:rFonts w:ascii="Calibri" w:hAnsi="Calibri"/>
+          <w:color w:val="BB0000"/>
+        </w:rPr>
+        <w:t>Fast path: test without logins (TEST MODE)</w:t>
+      </w:r>
+    </w:p>
+    <w:tbl>
+      <w:tblPr>
+        <w:tblW w:type="auto" w:w="0"/>
+        <w:tblLook w:firstColumn="1" w:firstRow="1" w:lastColumn="0" w:lastRow="0" w:noHBand="0" w:noVBand="1" w:val="04A0"/>
+      </w:tblPr>
+      <w:tblGrid>
+        <w:gridCol w:w="9648"/>
+      </w:tblGrid>
+      <w:tr>
+        <w:tc>
+          <w:tcPr>
+            <w:tcW w:type="dxa" w:w="9648"/>
+            <w:shd w:val="clear" w:color="auto" w:fill="FDE8EA"/>
+          </w:tcPr>
+          <w:p>
+            <w:r>
+              <w:rPr>
+                <w:b/>
+                <w:color w:val="BB0000"/>
+              </w:rPr>
+              <w:t xml:space="preserve">Use this to try every feature before setting up committee accounts.  </w:t>
+            </w:r>
+            <w:r>
+              <w:t>Do Steps 1 and 2, then the three steps below, and skip Steps 3-6 for now. While test mode is on, anyone with the link can approve, import or delete, so use test data only and do not announce the site.</w:t>
+            </w:r>
+          </w:p>
+        </w:tc>
+      </w:tr>
+    </w:tbl>
+    <w:p/>
+    <w:p>
+      <w:pPr>
+        <w:ind w:left="432" w:hanging="360"/>
+      </w:pPr>
+      <w:r>
+        <w:rPr>
+          <w:b/>
+        </w:rPr>
+        <w:t xml:space="preserve">1.  </w:t>
+      </w:r>
+      <w:r>
+        <w:t>In SQL Editor, run the script below (</w:t>
+      </w:r>
+      <w:r>
+        <w:rPr>
+          <w:rFonts w:ascii="Consolas" w:hAnsi="Consolas"/>
+          <w:color w:val="2B3D3A"/>
+          <w:sz w:val="20"/>
+        </w:rPr>
+        <w:t>supabase/test_mode_on.sql</w:t>
+      </w:r>
+      <w:r>
+        <w:t>). It must run after schema.sql.</w:t>
+      </w:r>
+    </w:p>
+    <w:tbl>
+      <w:tblPr>
+        <w:tblW w:type="auto" w:w="0"/>
+        <w:jc w:val="center"/>
+        <w:tblLook w:firstColumn="1" w:firstRow="1" w:lastColumn="0" w:lastRow="0" w:noHBand="0" w:noVBand="1" w:val="04A0"/>
+      </w:tblPr>
+      <w:tblGrid>
+        <w:gridCol w:w="9648"/>
+      </w:tblGrid>
+      <w:tr>
+        <w:tc>
+          <w:tcPr>
+            <w:tcW w:type="dxa" w:w="9648"/>
+            <w:shd w:val="clear" w:color="auto" w:fill="F3F4F1"/>
+          </w:tcPr>
+          <w:p>
+            <w:pPr>
+              <w:spacing w:after="0"/>
+            </w:pPr>
+            <w:r/>
+            <w:r>
+              <w:rPr>
+                <w:rFonts w:ascii="Consolas" w:hAnsi="Consolas"/>
+                <w:sz w:val="17"/>
+                <w:rFonts w:eastAsia="Consolas"/>
+              </w:rPr>
+              <w:t>-- TEST MODE ON - lets the anon (not-signed-in) role do everything an admin can,</w:t>
+              <w:br/>
+            </w:r>
+            <w:r>
+              <w:rPr>
+                <w:rFonts w:ascii="Consolas" w:hAnsi="Consolas"/>
+                <w:sz w:val="17"/>
+                <w:rFonts w:eastAsia="Consolas"/>
+              </w:rPr>
+              <w:t>-- so the committee console works without Supabase logins or admins rows.</w:t>
+              <w:br/>
+            </w:r>
+            <w:r>
+              <w:rPr>
+                <w:rFonts w:ascii="Consolas" w:hAnsi="Consolas"/>
+                <w:sz w:val="17"/>
+                <w:rFonts w:eastAsia="Consolas"/>
+              </w:rPr>
+              <w:t>-- Run AFTER schema.sql. Anyone with the site link can approve/delete while this is on.</w:t>
+              <w:br/>
+            </w:r>
+            <w:r>
+              <w:rPr>
+                <w:rFonts w:ascii="Consolas" w:hAnsi="Consolas"/>
+                <w:sz w:val="17"/>
+                <w:rFonts w:eastAsia="Consolas"/>
+              </w:rPr>
+              <w:t>-- Undo with test_mode_off.sql.</w:t>
+              <w:br/>
+            </w:r>
+            <w:r>
+              <w:rPr>
+                <w:rFonts w:ascii="Consolas" w:hAnsi="Consolas"/>
+                <w:sz w:val="17"/>
+                <w:rFonts w:eastAsia="Consolas"/>
+              </w:rPr>
+              <w:br/>
+            </w:r>
+            <w:r>
+              <w:rPr>
+                <w:rFonts w:ascii="Consolas" w:hAnsi="Consolas"/>
+                <w:sz w:val="17"/>
+                <w:rFonts w:eastAsia="Consolas"/>
+              </w:rPr>
+              <w:t>do $$ declare t text; begin</w:t>
+              <w:br/>
+            </w:r>
+            <w:r>
+              <w:rPr>
+                <w:rFonts w:ascii="Consolas" w:hAnsi="Consolas"/>
+                <w:sz w:val="17"/>
+                <w:rFonts w:eastAsia="Consolas"/>
+              </w:rPr>
+              <w:t xml:space="preserve">  foreach t in array array['families','adults','settings','entries'] loop</w:t>
+              <w:br/>
+            </w:r>
+            <w:r>
+              <w:rPr>
+                <w:rFonts w:ascii="Consolas" w:hAnsi="Consolas"/>
+                <w:sz w:val="17"/>
+                <w:rFonts w:eastAsia="Consolas"/>
+              </w:rPr>
+              <w:t xml:space="preserve">    execute format('drop policy if exists %1$s_test_anon on %1$s', t);</w:t>
+              <w:br/>
+            </w:r>
+            <w:r>
+              <w:rPr>
+                <w:rFonts w:ascii="Consolas" w:hAnsi="Consolas"/>
+                <w:sz w:val="17"/>
+                <w:rFonts w:eastAsia="Consolas"/>
+              </w:rPr>
+              <w:t xml:space="preserve">    execute format('create policy %1$s_test_anon on %1$s for all to anon, authenticated using (true) with check (true)', t);</w:t>
+              <w:br/>
+            </w:r>
+            <w:r>
+              <w:rPr>
+                <w:rFonts w:ascii="Consolas" w:hAnsi="Consolas"/>
+                <w:sz w:val="17"/>
+                <w:rFonts w:eastAsia="Consolas"/>
+              </w:rPr>
+              <w:t xml:space="preserve">  end loop; end $$;</w:t>
+              <w:br/>
+            </w:r>
+            <w:r>
+              <w:rPr>
+                <w:rFonts w:ascii="Consolas" w:hAnsi="Consolas"/>
+                <w:sz w:val="17"/>
+                <w:rFonts w:eastAsia="Consolas"/>
+              </w:rPr>
+              <w:br/>
+            </w:r>
+            <w:r>
+              <w:rPr>
+                <w:rFonts w:ascii="Consolas" w:hAnsi="Consolas"/>
+                <w:sz w:val="17"/>
+                <w:rFonts w:eastAsia="Consolas"/>
+              </w:rPr>
+              <w:t>-- the console reads full rows (incl. pending) straight from entries</w:t>
+              <w:br/>
+            </w:r>
+            <w:r>
+              <w:rPr>
+                <w:rFonts w:ascii="Consolas" w:hAnsi="Consolas"/>
+                <w:sz w:val="17"/>
+                <w:rFonts w:eastAsia="Consolas"/>
+              </w:rPr>
+              <w:t>grant select, insert, update, delete on families, adults, settings, entries to anon;</w:t>
+              <w:br/>
+            </w:r>
+            <w:r>
+              <w:rPr>
+                <w:rFonts w:ascii="Consolas" w:hAnsi="Consolas"/>
+                <w:sz w:val="17"/>
+                <w:rFonts w:eastAsia="Consolas"/>
+              </w:rPr>
+              <w:br/>
+            </w:r>
+            <w:r>
+              <w:rPr>
+                <w:rFonts w:ascii="Consolas" w:hAnsi="Consolas"/>
+                <w:sz w:val="17"/>
+                <w:rFonts w:eastAsia="Consolas"/>
+              </w:rPr>
+              <w:t>select 'TEST MODE ON' as status;</w:t>
+            </w:r>
+          </w:p>
+        </w:tc>
+      </w:tr>
+    </w:tbl>
+    <w:p/>
+    <w:p>
+      <w:pPr>
+        <w:ind w:left="432" w:hanging="360"/>
+      </w:pPr>
+      <w:r>
+        <w:rPr>
+          <w:b/>
+        </w:rPr>
+        <w:t xml:space="preserve">2.  </w:t>
+      </w:r>
+      <w:r>
+        <w:t xml:space="preserve">Do Step 7 (paste the Project URL and key into </w:t>
+      </w:r>
+      <w:r>
+        <w:rPr>
+          <w:rFonts w:ascii="Consolas" w:hAnsi="Consolas"/>
+          <w:color w:val="2B3D3A"/>
+          <w:sz w:val="20"/>
+        </w:rPr>
+        <w:t>config.js</w:t>
+      </w:r>
+      <w:r>
+        <w:t xml:space="preserve">) and make sure </w:t>
+      </w:r>
+      <w:r>
+        <w:rPr>
+          <w:rFonts w:ascii="Consolas" w:hAnsi="Consolas"/>
+          <w:color w:val="2B3D3A"/>
+          <w:sz w:val="20"/>
+        </w:rPr>
+        <w:t>TEST_MODE: true</w:t>
+      </w:r>
+      <w:r>
+        <w:t xml:space="preserve"> is set. The repository ships with it on.</w:t>
+      </w:r>
+    </w:p>
+    <w:p>
+      <w:pPr>
+        <w:ind w:left="432" w:hanging="360"/>
+      </w:pPr>
+      <w:r>
+        <w:rPr>
+          <w:b/>
+        </w:rPr>
+        <w:t xml:space="preserve">3.  </w:t>
+      </w:r>
+      <w:r>
+        <w:t xml:space="preserve">Reload the site. A red </w:t>
+      </w:r>
+      <w:r>
+        <w:rPr>
+          <w:b/>
+        </w:rPr>
+        <w:t>Test mode</w:t>
+      </w:r>
+      <w:r>
+        <w:t xml:space="preserve"> banner shows. Click </w:t>
+      </w:r>
+      <w:r>
+        <w:rPr>
+          <w:b/>
+        </w:rPr>
+        <w:t>Committee</w:t>
+      </w:r>
+      <w:r>
+        <w:t xml:space="preserve">, type the name you are acting as (or leave it blank), click </w:t>
+      </w:r>
+      <w:r>
+        <w:rPr>
+          <w:b/>
+        </w:rPr>
+        <w:t>Open console</w:t>
+      </w:r>
+      <w:r>
+        <w:t>, then work through Steps 8 and 9.</w:t>
+      </w:r>
+    </w:p>
+    <w:p>
+      <w:r>
+        <w:rPr>
+          <w:b/>
+          <w:i w:val="0"/>
+          <w:color w:val="2B3D3A"/>
+        </w:rPr>
+        <w:t>Turning test mode off (before real use)</w:t>
+      </w:r>
+    </w:p>
+    <w:p>
+      <w:pPr>
+        <w:ind w:left="432" w:hanging="360"/>
+      </w:pPr>
+      <w:r>
+        <w:rPr>
+          <w:b/>
+        </w:rPr>
+        <w:t xml:space="preserve">4.  </w:t>
+      </w:r>
+      <w:r>
+        <w:t xml:space="preserve">Run </w:t>
+      </w:r>
+      <w:r>
+        <w:rPr>
+          <w:rFonts w:ascii="Consolas" w:hAnsi="Consolas"/>
+          <w:color w:val="2B3D3A"/>
+          <w:sz w:val="20"/>
+        </w:rPr>
+        <w:t>supabase/test_mode_off.sql</w:t>
+      </w:r>
+      <w:r>
+        <w:t xml:space="preserve"> below. Uncomment its last line to wipe the test data.</w:t>
+      </w:r>
+    </w:p>
+    <w:tbl>
+      <w:tblPr>
+        <w:tblW w:type="auto" w:w="0"/>
+        <w:jc w:val="center"/>
+        <w:tblLook w:firstColumn="1" w:firstRow="1" w:lastColumn="0" w:lastRow="0" w:noHBand="0" w:noVBand="1" w:val="04A0"/>
+      </w:tblPr>
+      <w:tblGrid>
+        <w:gridCol w:w="9648"/>
+      </w:tblGrid>
+      <w:tr>
+        <w:tc>
+          <w:tcPr>
+            <w:tcW w:type="dxa" w:w="9648"/>
+            <w:shd w:val="clear" w:color="auto" w:fill="F3F4F1"/>
+          </w:tcPr>
+          <w:p>
+            <w:pPr>
+              <w:spacing w:after="0"/>
+            </w:pPr>
+            <w:r/>
+            <w:r>
+              <w:rPr>
+                <w:rFonts w:ascii="Consolas" w:hAnsi="Consolas"/>
+                <w:sz w:val="17"/>
+                <w:rFonts w:eastAsia="Consolas"/>
+              </w:rPr>
+              <w:t>-- TEST MODE OFF - removes the open test policies; schema.sql's real rules apply again.</w:t>
+              <w:br/>
+            </w:r>
+            <w:r>
+              <w:rPr>
+                <w:rFonts w:ascii="Consolas" w:hAnsi="Consolas"/>
+                <w:sz w:val="17"/>
+                <w:rFonts w:eastAsia="Consolas"/>
+              </w:rPr>
+              <w:t>-- Also set TEST_MODE: false in config.js. Optional: clear test data (last block).</w:t>
+              <w:br/>
+            </w:r>
+            <w:r>
+              <w:rPr>
+                <w:rFonts w:ascii="Consolas" w:hAnsi="Consolas"/>
+                <w:sz w:val="17"/>
+                <w:rFonts w:eastAsia="Consolas"/>
+              </w:rPr>
+              <w:br/>
+            </w:r>
+            <w:r>
+              <w:rPr>
+                <w:rFonts w:ascii="Consolas" w:hAnsi="Consolas"/>
+                <w:sz w:val="17"/>
+                <w:rFonts w:eastAsia="Consolas"/>
+              </w:rPr>
+              <w:t>do $$ declare t text; begin</w:t>
+              <w:br/>
+            </w:r>
+            <w:r>
+              <w:rPr>
+                <w:rFonts w:ascii="Consolas" w:hAnsi="Consolas"/>
+                <w:sz w:val="17"/>
+                <w:rFonts w:eastAsia="Consolas"/>
+              </w:rPr>
+              <w:t xml:space="preserve">  foreach t in array array['families','adults','settings','entries'] loop</w:t>
+              <w:br/>
+            </w:r>
+            <w:r>
+              <w:rPr>
+                <w:rFonts w:ascii="Consolas" w:hAnsi="Consolas"/>
+                <w:sz w:val="17"/>
+                <w:rFonts w:eastAsia="Consolas"/>
+              </w:rPr>
+              <w:t xml:space="preserve">    execute format('drop policy if exists %1$s_test_anon on %1$s', t);</w:t>
+              <w:br/>
+            </w:r>
+            <w:r>
+              <w:rPr>
+                <w:rFonts w:ascii="Consolas" w:hAnsi="Consolas"/>
+                <w:sz w:val="17"/>
+                <w:rFonts w:eastAsia="Consolas"/>
+              </w:rPr>
+              <w:t xml:space="preserve">  end loop; end $$;</w:t>
+              <w:br/>
+            </w:r>
+            <w:r>
+              <w:rPr>
+                <w:rFonts w:ascii="Consolas" w:hAnsi="Consolas"/>
+                <w:sz w:val="17"/>
+                <w:rFonts w:eastAsia="Consolas"/>
+              </w:rPr>
+              <w:br/>
+            </w:r>
+            <w:r>
+              <w:rPr>
+                <w:rFonts w:ascii="Consolas" w:hAnsi="Consolas"/>
+                <w:sz w:val="17"/>
+                <w:rFonts w:eastAsia="Consolas"/>
+              </w:rPr>
+              <w:t>select 'TEST MODE OFF' as status;</w:t>
+              <w:br/>
+            </w:r>
+            <w:r>
+              <w:rPr>
+                <w:rFonts w:ascii="Consolas" w:hAnsi="Consolas"/>
+                <w:sz w:val="17"/>
+                <w:rFonts w:eastAsia="Consolas"/>
+              </w:rPr>
+              <w:br/>
+            </w:r>
+            <w:r>
+              <w:rPr>
+                <w:rFonts w:ascii="Consolas" w:hAnsi="Consolas"/>
+                <w:sz w:val="17"/>
+                <w:rFonts w:eastAsia="Consolas"/>
+              </w:rPr>
+              <w:t>-- Optional: wipe everything entered during testing (uncomment to run)</w:t>
+              <w:br/>
+            </w:r>
+            <w:r>
+              <w:rPr>
+                <w:rFonts w:ascii="Consolas" w:hAnsi="Consolas"/>
+                <w:sz w:val="17"/>
+                <w:rFonts w:eastAsia="Consolas"/>
+              </w:rPr>
+              <w:t>-- delete from entries; delete from adults; delete from families; delete from settings;</w:t>
+            </w:r>
+          </w:p>
+        </w:tc>
+      </w:tr>
+    </w:tbl>
+    <w:p/>
+    <w:p>
+      <w:pPr>
+        <w:ind w:left="432" w:hanging="360"/>
+      </w:pPr>
+      <w:r>
+        <w:rPr>
+          <w:b/>
+        </w:rPr>
+        <w:t xml:space="preserve">5.  </w:t>
+      </w:r>
+      <w:r>
+        <w:t xml:space="preserve">Set </w:t>
+      </w:r>
+      <w:r>
+        <w:rPr>
+          <w:rFonts w:ascii="Consolas" w:hAnsi="Consolas"/>
+          <w:color w:val="2B3D3A"/>
+          <w:sz w:val="20"/>
+        </w:rPr>
+        <w:t>TEST_MODE: false</w:t>
+      </w:r>
+      <w:r>
+        <w:t xml:space="preserve"> in config.js and commit.</w:t>
+      </w:r>
+    </w:p>
+    <w:p>
+      <w:pPr>
+        <w:ind w:left="432" w:hanging="360"/>
+      </w:pPr>
+      <w:r>
+        <w:rPr>
+          <w:b/>
+        </w:rPr>
+        <w:t xml:space="preserve">6.  </w:t>
+      </w:r>
+      <w:r>
+        <w:t>Do Steps 3-6 (sign-ups off, site URL, logins, admins), then repeat the Step 9 test with real logins.</w:t>
       </w:r>
     </w:p>
     <w:p>
@@ -3908,6 +4416,17 @@
           <w:color w:val="BB0000"/>
         </w:rPr>
         <w:t>Step 10 - Go-live checklist</w:t>
+      </w:r>
+    </w:p>
+    <w:p>
+      <w:r>
+        <w:rPr>
+          <w:sz w:val="24"/>
+        </w:rPr>
+        <w:t xml:space="preserve">☐  </w:t>
+      </w:r>
+      <w:r>
+        <w:t>TEST MODE OFF: test_mode_off.sql run and TEST_MODE: false in config.js</w:t>
       </w:r>
     </w:p>
     <w:p>

</xml_diff>

<commit_message>
Use official Troop420Logo.png (header, footer, favicon, guide); exact logo green/gold
</commit_message>
<xml_diff>
--- a/docs/Troop420_Supabase_Setup_Guide.docx
+++ b/docs/Troop420_Supabase_Setup_Guide.docx
@@ -77,7 +77,7 @@
         <w:rPr>
           <w:b/>
           <w:i w:val="0"/>
-          <w:color w:val="2B3D3A"/>
+          <w:color w:val="2D3D3C"/>
           <w:sz w:val="28"/>
         </w:rPr>
         <w:t>Supabase setup guide: from demo mode to a live, shared system</w:t>
@@ -111,7 +111,7 @@
         <w:tc>
           <w:tcPr>
             <w:tcW w:type="dxa" w:w="2592"/>
-            <w:shd w:val="clear" w:color="auto" w:fill="2B3D3A"/>
+            <w:shd w:val="clear" w:color="auto" w:fill="2D3D3C"/>
           </w:tcPr>
           <w:p>
             <w:r/>
@@ -128,7 +128,7 @@
         <w:tc>
           <w:tcPr>
             <w:tcW w:type="dxa" w:w="7056"/>
-            <w:shd w:val="clear" w:color="auto" w:fill="2B3D3A"/>
+            <w:shd w:val="clear" w:color="auto" w:fill="2D3D3C"/>
           </w:tcPr>
           <w:p>
             <w:r/>
@@ -302,7 +302,7 @@
       <w:r>
         <w:rPr>
           <w:rFonts w:ascii="Calibri" w:hAnsi="Calibri"/>
-          <w:color w:val="2B3D3A"/>
+          <w:color w:val="2D3D3C"/>
         </w:rPr>
         <w:t>What this changes</w:t>
       </w:r>
@@ -359,7 +359,7 @@
       <w:r>
         <w:rPr>
           <w:rFonts w:ascii="Calibri" w:hAnsi="Calibri"/>
-          <w:color w:val="2B3D3A"/>
+          <w:color w:val="2D3D3C"/>
         </w:rPr>
         <w:t>Before you start</w:t>
       </w:r>
@@ -482,7 +482,7 @@
       <w:r>
         <w:rPr>
           <w:rFonts w:ascii="Consolas" w:hAnsi="Consolas"/>
-          <w:color w:val="2B3D3A"/>
+          <w:color w:val="2D3D3C"/>
           <w:sz w:val="20"/>
         </w:rPr>
         <w:t>Troop 420 Bothell</w:t>
@@ -537,7 +537,7 @@
         <w:tc>
           <w:tcPr>
             <w:tcW w:type="dxa" w:w="2592"/>
-            <w:shd w:val="clear" w:color="auto" w:fill="2B3D3A"/>
+            <w:shd w:val="clear" w:color="auto" w:fill="2D3D3C"/>
           </w:tcPr>
           <w:p>
             <w:r/>
@@ -554,7 +554,7 @@
         <w:tc>
           <w:tcPr>
             <w:tcW w:type="dxa" w:w="7056"/>
-            <w:shd w:val="clear" w:color="auto" w:fill="2B3D3A"/>
+            <w:shd w:val="clear" w:color="auto" w:fill="2D3D3C"/>
           </w:tcPr>
           <w:p>
             <w:r/>
@@ -831,7 +831,7 @@
             <w:r>
               <w:rPr>
                 <w:b/>
-                <w:color w:val="2B3D3A"/>
+                <w:color w:val="2D3D3C"/>
               </w:rPr>
               <w:t xml:space="preserve">What it creates:  </w:t>
             </w:r>
@@ -848,7 +848,7 @@
         <w:rPr>
           <w:b/>
           <w:i w:val="0"/>
-          <w:color w:val="2B3D3A"/>
+          <w:color w:val="2D3D3C"/>
         </w:rPr>
         <w:t>supabase/schema.sql (complete)</w:t>
       </w:r>
@@ -1803,7 +1803,7 @@
       <w:r>
         <w:rPr>
           <w:rFonts w:ascii="Consolas" w:hAnsi="Consolas"/>
-          <w:color w:val="2B3D3A"/>
+          <w:color w:val="2D3D3C"/>
           <w:sz w:val="20"/>
         </w:rPr>
         <w:t>admins, adults, entries, families, settings</w:t>
@@ -1822,7 +1822,7 @@
       <w:r>
         <w:rPr>
           <w:rFonts w:ascii="Consolas" w:hAnsi="Consolas"/>
-          <w:color w:val="2B3D3A"/>
+          <w:color w:val="2D3D3C"/>
           <w:sz w:val="20"/>
         </w:rPr>
         <w:t>public_entries</w:t>
@@ -1894,7 +1894,7 @@
       <w:r>
         <w:rPr>
           <w:rFonts w:ascii="Consolas" w:hAnsi="Consolas"/>
-          <w:color w:val="2B3D3A"/>
+          <w:color w:val="2D3D3C"/>
           <w:sz w:val="20"/>
         </w:rPr>
         <w:t>supabase/test_mode_on.sql</w:t>
@@ -2075,7 +2075,7 @@
       <w:r>
         <w:rPr>
           <w:rFonts w:ascii="Consolas" w:hAnsi="Consolas"/>
-          <w:color w:val="2B3D3A"/>
+          <w:color w:val="2D3D3C"/>
           <w:sz w:val="20"/>
         </w:rPr>
         <w:t>config.js</w:t>
@@ -2086,7 +2086,7 @@
       <w:r>
         <w:rPr>
           <w:rFonts w:ascii="Consolas" w:hAnsi="Consolas"/>
-          <w:color w:val="2B3D3A"/>
+          <w:color w:val="2D3D3C"/>
           <w:sz w:val="20"/>
         </w:rPr>
         <w:t>TEST_MODE: true</w:t>
@@ -2141,7 +2141,7 @@
         <w:rPr>
           <w:b/>
           <w:i w:val="0"/>
-          <w:color w:val="2B3D3A"/>
+          <w:color w:val="2D3D3C"/>
         </w:rPr>
         <w:t>Turning test mode off (before real use)</w:t>
       </w:r>
@@ -2162,7 +2162,7 @@
       <w:r>
         <w:rPr>
           <w:rFonts w:ascii="Consolas" w:hAnsi="Consolas"/>
-          <w:color w:val="2B3D3A"/>
+          <w:color w:val="2D3D3C"/>
           <w:sz w:val="20"/>
         </w:rPr>
         <w:t>supabase/test_mode_off.sql</w:t>
@@ -2316,7 +2316,7 @@
       <w:r>
         <w:rPr>
           <w:rFonts w:ascii="Consolas" w:hAnsi="Consolas"/>
-          <w:color w:val="2B3D3A"/>
+          <w:color w:val="2D3D3C"/>
           <w:sz w:val="20"/>
         </w:rPr>
         <w:t>TEST_MODE: false</w:t>
@@ -2470,7 +2470,7 @@
             <w:r>
               <w:rPr>
                 <w:b/>
-                <w:color w:val="2B3D3A"/>
+                <w:color w:val="2D3D3C"/>
               </w:rPr>
               <w:t xml:space="preserve">Why:  </w:t>
             </w:r>
@@ -2542,7 +2542,7 @@
       <w:r>
         <w:rPr>
           <w:rFonts w:ascii="Consolas" w:hAnsi="Consolas"/>
-          <w:color w:val="2B3D3A"/>
+          <w:color w:val="2D3D3C"/>
           <w:sz w:val="20"/>
         </w:rPr>
         <w:t>https://sfc-gh-dfreriks.github.io/troop420-volunteer-points/</w:t>
@@ -2789,7 +2789,7 @@
         <w:tc>
           <w:tcPr>
             <w:tcW w:type="dxa" w:w="1584"/>
-            <w:shd w:val="clear" w:color="auto" w:fill="2B3D3A"/>
+            <w:shd w:val="clear" w:color="auto" w:fill="2D3D3C"/>
           </w:tcPr>
           <w:p>
             <w:r/>
@@ -2806,7 +2806,7 @@
         <w:tc>
           <w:tcPr>
             <w:tcW w:type="dxa" w:w="4032"/>
-            <w:shd w:val="clear" w:color="auto" w:fill="2B3D3A"/>
+            <w:shd w:val="clear" w:color="auto" w:fill="2D3D3C"/>
           </w:tcPr>
           <w:p>
             <w:r/>
@@ -2823,7 +2823,7 @@
         <w:tc>
           <w:tcPr>
             <w:tcW w:type="dxa" w:w="4032"/>
-            <w:shd w:val="clear" w:color="auto" w:fill="2B3D3A"/>
+            <w:shd w:val="clear" w:color="auto" w:fill="2D3D3C"/>
           </w:tcPr>
           <w:p>
             <w:r/>
@@ -3140,7 +3140,7 @@
       <w:r>
         <w:rPr>
           <w:rFonts w:ascii="Consolas" w:hAnsi="Consolas"/>
-          <w:color w:val="2B3D3A"/>
+          <w:color w:val="2D3D3C"/>
           <w:sz w:val="20"/>
         </w:rPr>
         <w:t>https://abcdefghijkl.supabase.co</w:t>
@@ -3183,7 +3183,7 @@
       <w:r>
         <w:rPr>
           <w:rFonts w:ascii="Consolas" w:hAnsi="Consolas"/>
-          <w:color w:val="2B3D3A"/>
+          <w:color w:val="2D3D3C"/>
           <w:sz w:val="20"/>
         </w:rPr>
         <w:t>sb_publishable_…</w:t>
@@ -3203,7 +3203,7 @@
       <w:r>
         <w:rPr>
           <w:rFonts w:ascii="Consolas" w:hAnsi="Consolas"/>
-          <w:color w:val="2B3D3A"/>
+          <w:color w:val="2D3D3C"/>
           <w:sz w:val="20"/>
         </w:rPr>
         <w:t>eyJ…</w:t>
@@ -3258,7 +3258,7 @@
       <w:r>
         <w:rPr>
           <w:rFonts w:ascii="Consolas" w:hAnsi="Consolas"/>
-          <w:color w:val="2B3D3A"/>
+          <w:color w:val="2D3D3C"/>
           <w:sz w:val="20"/>
         </w:rPr>
         <w:t>config.js</w:t>
@@ -3678,7 +3678,7 @@
         <w:tc>
           <w:tcPr>
             <w:tcW w:type="dxa" w:w="4032"/>
-            <w:shd w:val="clear" w:color="auto" w:fill="2B3D3A"/>
+            <w:shd w:val="clear" w:color="auto" w:fill="2D3D3C"/>
           </w:tcPr>
           <w:p>
             <w:r/>
@@ -3695,7 +3695,7 @@
         <w:tc>
           <w:tcPr>
             <w:tcW w:type="dxa" w:w="5616"/>
-            <w:shd w:val="clear" w:color="auto" w:fill="2B3D3A"/>
+            <w:shd w:val="clear" w:color="auto" w:fill="2D3D3C"/>
           </w:tcPr>
           <w:p>
             <w:r/>
@@ -3874,7 +3874,7 @@
         <w:tc>
           <w:tcPr>
             <w:tcW w:type="dxa" w:w="432"/>
-            <w:shd w:val="clear" w:color="auto" w:fill="2B3D3A"/>
+            <w:shd w:val="clear" w:color="auto" w:fill="2D3D3C"/>
           </w:tcPr>
           <w:p>
             <w:r/>
@@ -3891,7 +3891,7 @@
         <w:tc>
           <w:tcPr>
             <w:tcW w:type="dxa" w:w="2448"/>
-            <w:shd w:val="clear" w:color="auto" w:fill="2B3D3A"/>
+            <w:shd w:val="clear" w:color="auto" w:fill="2D3D3C"/>
           </w:tcPr>
           <w:p>
             <w:r/>
@@ -3908,7 +3908,7 @@
         <w:tc>
           <w:tcPr>
             <w:tcW w:type="dxa" w:w="3456"/>
-            <w:shd w:val="clear" w:color="auto" w:fill="2B3D3A"/>
+            <w:shd w:val="clear" w:color="auto" w:fill="2D3D3C"/>
           </w:tcPr>
           <w:p>
             <w:r/>
@@ -3925,7 +3925,7 @@
         <w:tc>
           <w:tcPr>
             <w:tcW w:type="dxa" w:w="3312"/>
-            <w:shd w:val="clear" w:color="auto" w:fill="2B3D3A"/>
+            <w:shd w:val="clear" w:color="auto" w:fill="2D3D3C"/>
           </w:tcPr>
           <w:p>
             <w:r/>
@@ -4565,7 +4565,7 @@
         <w:tc>
           <w:tcPr>
             <w:tcW w:type="dxa" w:w="2736"/>
-            <w:shd w:val="clear" w:color="auto" w:fill="2B3D3A"/>
+            <w:shd w:val="clear" w:color="auto" w:fill="2D3D3C"/>
           </w:tcPr>
           <w:p>
             <w:r/>
@@ -4582,7 +4582,7 @@
         <w:tc>
           <w:tcPr>
             <w:tcW w:type="dxa" w:w="6912"/>
-            <w:shd w:val="clear" w:color="auto" w:fill="2B3D3A"/>
+            <w:shd w:val="clear" w:color="auto" w:fill="2D3D3C"/>
           </w:tcPr>
           <w:p>
             <w:r/>
@@ -5134,7 +5134,7 @@
         <w:tc>
           <w:tcPr>
             <w:tcW w:type="dxa" w:w="3744"/>
-            <w:shd w:val="clear" w:color="auto" w:fill="2B3D3A"/>
+            <w:shd w:val="clear" w:color="auto" w:fill="2D3D3C"/>
           </w:tcPr>
           <w:p>
             <w:r/>
@@ -5151,7 +5151,7 @@
         <w:tc>
           <w:tcPr>
             <w:tcW w:type="dxa" w:w="5904"/>
-            <w:shd w:val="clear" w:color="auto" w:fill="2B3D3A"/>
+            <w:shd w:val="clear" w:color="auto" w:fill="2D3D3C"/>
           </w:tcPr>
           <w:p>
             <w:r/>
@@ -5465,7 +5465,7 @@
         <w:tc>
           <w:tcPr>
             <w:tcW w:type="dxa" w:w="5616"/>
-            <w:shd w:val="clear" w:color="auto" w:fill="2B3D3A"/>
+            <w:shd w:val="clear" w:color="auto" w:fill="2D3D3C"/>
           </w:tcPr>
           <w:p>
             <w:r/>
@@ -5482,7 +5482,7 @@
         <w:tc>
           <w:tcPr>
             <w:tcW w:type="dxa" w:w="1440"/>
-            <w:shd w:val="clear" w:color="auto" w:fill="2B3D3A"/>
+            <w:shd w:val="clear" w:color="auto" w:fill="2D3D3C"/>
           </w:tcPr>
           <w:p>
             <w:r/>
@@ -5499,7 +5499,7 @@
         <w:tc>
           <w:tcPr>
             <w:tcW w:type="dxa" w:w="2592"/>
-            <w:shd w:val="clear" w:color="auto" w:fill="2B3D3A"/>
+            <w:shd w:val="clear" w:color="auto" w:fill="2D3D3C"/>
           </w:tcPr>
           <w:p>
             <w:r/>

</xml_diff>